<commit_message>
Add Kinwong and Dongshan trader comparison with verified forward valuations
</commit_message>
<xml_diff>
--- a/Upcoming_IPO_Trader_Brief_2026-10-13.docx
+++ b/Upcoming_IPO_Trader_Brief_2026-10-13.docx
@@ -6586,6 +6586,1273 @@
             <w:u w:val="single"/>
           </w:rPr>
           <w:t xml:space="preserve">HKEX PHIP register</w:t>
+        </w:r>
+      </w:hyperlink>
+    </w:p>
+    <w:p>
+      <w:pPr>
+        <w:rPr>
+          <w:rFonts w:ascii="Arial" w:hAnsi="Arial" w:cs="Arial"/>
+          <w:color w:val="FF0000"/>
+          <w:sz w:val="20"/>
+          <w:szCs w:val="20"/>
+        </w:rPr>
+        <w:spacing w:after="85" w:before="0" w:line="240" w:lineRule="auto"/>
+        <w:keepLines/>
+        <w:pageBreakBefore/>
+        <w:keepNext/>
+      </w:pPr>
+      <w:r>
+        <w:rPr>
+          <w:rFonts w:ascii="Arial" w:hAnsi="Arial" w:cs="Arial"/>
+          <w:b/>
+          <w:bCs/>
+          <w:color w:val="FF0000"/>
+          <w:sz w:val="20"/>
+          <w:szCs w:val="20"/>
+        </w:rPr>
+        <w:t>Kinwong versus Dongshan</w:t>
+      </w:r>
+    </w:p>
+    <w:p>
+      <w:pPr>
+        <w:rPr>
+          <w:rFonts w:ascii="Arial" w:eastAsiaTheme="minorEastAsia" w:hAnsi="Arial" w:cs="Arial"/>
+          <w:color w:val="153D63"/>
+          <w:sz w:val="20"/>
+          <w:szCs w:val="20"/>
+        </w:rPr>
+        <w:spacing w:after="90" w:before="0" w:line="240" w:lineRule="auto"/>
+        <w:keepLines/>
+        <w:keepNext/>
+      </w:pPr>
+      <w:r>
+        <w:rPr>
+          <w:rFonts w:ascii="Arial" w:hAnsi="Arial" w:cs="Arial"/>
+          <w:color w:val="153D63"/>
+          <w:sz w:val="20"/>
+          <w:szCs w:val="20"/>
+          <w:b/>
+          <w:bCs/>
+        </w:rPr>
+        <w:t xml:space="preserve">Trade read.</w:t>
+      </w:r>
+      <w:r>
+        <w:rPr>
+          <w:rFonts w:ascii="Arial" w:hAnsi="Arial" w:cs="Arial"/>
+          <w:color w:val="153D63"/>
+          <w:sz w:val="20"/>
+          <w:szCs w:val="20"/>
+        </w:rPr>
+        <w:t xml:space="preserve"> Kinwong H is the PCB valuation anchor for Dongshan's H offer. Dongshan adds complete optical modules and a larger earnings ramp. At current prices, Kinwong H is cheaper on FY2026E profit; Dongshan A becomes cheaper on FY2027E only after its forecast profit more than doubles.</w:t>
+      </w:r>
+    </w:p>
+    <w:tbl>
+      <w:tblPr>
+        <w:tblW w:w="9972" w:type="dxa"/>
+        <w:tblCellMar>
+          <w:left w:w="60" w:type="dxa"/>
+          <w:right w:w="60" w:type="dxa"/>
+          <w:top w:w="65" w:type="dxa"/>
+          <w:bottom w:w="65" w:type="dxa"/>
+        </w:tblCellMar>
+        <w:tblLook w:val="04A0" w:firstRow="1" w:lastRow="0" w:firstColumn="1" w:lastColumn="0" w:noHBand="0" w:noVBand="1"/>
+        <w:tblLayout w:type="fixed"/>
+        <w:tblInd w:w="0" w:type="dxa"/>
+        <w:tblBorders>
+          <w:top w:val="single" w:sz="4" w:space="0" w:color="D9D9D9"/>
+          <w:left w:val="single" w:sz="4" w:space="0" w:color="D9D9D9"/>
+          <w:bottom w:val="single" w:sz="4" w:space="0" w:color="D9D9D9"/>
+          <w:right w:val="single" w:sz="4" w:space="0" w:color="D9D9D9"/>
+          <w:insideH w:val="single" w:sz="4" w:space="0" w:color="D9D9D9"/>
+          <w:insideV w:val="single" w:sz="4" w:space="0" w:color="D9D9D9"/>
+        </w:tblBorders>
+      </w:tblPr>
+      <w:tblGrid>
+        <w:gridCol w:w="2500"/>
+        <w:gridCol w:w="3736"/>
+        <w:gridCol w:w="3736"/>
+      </w:tblGrid>
+      <w:tr>
+        <w:trPr>
+          <w:cantSplit/>
+          <w:tblHeader/>
+        </w:trPr>
+        <w:tc>
+          <w:tcPr>
+            <w:tcW w:w="2500" w:type="dxa"/>
+            <w:vAlign w:val="center"/>
+            <w:shd w:val="clear" w:color="auto" w:fill="F2F2F2"/>
+          </w:tcPr>
+          <w:p>
+            <w:pPr>
+              <w:rPr>
+                <w:rFonts w:ascii="Arial" w:eastAsiaTheme="minorEastAsia" w:hAnsi="Arial" w:cs="Arial"/>
+                <w:color w:val="153D63"/>
+                <w:sz w:val="20"/>
+                <w:szCs w:val="20"/>
+              </w:rPr>
+              <w:spacing w:after="0" w:before="0" w:line="240" w:lineRule="auto"/>
+              <w:keepLines/>
+              <w:jc w:val="left"/>
+              <w:keepNext/>
+            </w:pPr>
+            <w:r>
+              <w:rPr>
+                <w:rFonts w:ascii="Arial" w:hAnsi="Arial" w:cs="Arial"/>
+                <w:color w:val="153D63"/>
+                <w:sz w:val="20"/>
+                <w:szCs w:val="20"/>
+                <w:b/>
+                <w:bCs/>
+              </w:rPr>
+              <w:t xml:space="preserve">Metric</w:t>
+            </w:r>
+          </w:p>
+        </w:tc>
+        <w:tc>
+          <w:tcPr>
+            <w:tcW w:w="3736" w:type="dxa"/>
+            <w:hideMark/>
+            <w:vAlign w:val="center"/>
+            <w:shd w:val="clear" w:color="auto" w:fill="F2F2F2"/>
+          </w:tcPr>
+          <w:p>
+            <w:pPr>
+              <w:rPr>
+                <w:rFonts w:ascii="Arial" w:eastAsiaTheme="minorEastAsia" w:hAnsi="Arial" w:cs="Arial"/>
+                <w:color w:val="153D63"/>
+                <w:sz w:val="20"/>
+                <w:szCs w:val="20"/>
+              </w:rPr>
+              <w:spacing w:after="0" w:before="0" w:line="240" w:lineRule="auto"/>
+              <w:keepLines/>
+              <w:jc w:val="left"/>
+              <w:keepNext/>
+            </w:pPr>
+            <w:r>
+              <w:rPr>
+                <w:rFonts w:ascii="Arial" w:hAnsi="Arial" w:cs="Arial"/>
+                <w:color w:val="153D63"/>
+                <w:sz w:val="20"/>
+                <w:szCs w:val="20"/>
+                <w:b/>
+                <w:bCs/>
+              </w:rPr>
+              <w:t xml:space="preserve">Kinwong H (03228 HK)</w:t>
+              <w:br/>
+              <w:t xml:space="preserve">HK$71.750; A RMB98.51</w:t>
+            </w:r>
+          </w:p>
+        </w:tc>
+        <w:tc>
+          <w:tcPr>
+            <w:tcW w:w="3736" w:type="dxa"/>
+            <w:hideMark/>
+            <w:vAlign w:val="center"/>
+            <w:shd w:val="clear" w:color="auto" w:fill="F2F2F2"/>
+          </w:tcPr>
+          <w:p>
+            <w:pPr>
+              <w:rPr>
+                <w:rFonts w:ascii="Arial" w:eastAsiaTheme="minorEastAsia" w:hAnsi="Arial" w:cs="Arial"/>
+                <w:color w:val="153D63"/>
+                <w:sz w:val="20"/>
+                <w:szCs w:val="20"/>
+              </w:rPr>
+              <w:spacing w:after="0" w:before="0" w:line="240" w:lineRule="auto"/>
+              <w:keepLines/>
+              <w:jc w:val="left"/>
+              <w:keepNext/>
+            </w:pPr>
+            <w:r>
+              <w:rPr>
+                <w:rFonts w:ascii="Arial" w:hAnsi="Arial" w:cs="Arial"/>
+                <w:color w:val="153D63"/>
+                <w:sz w:val="20"/>
+                <w:szCs w:val="20"/>
+                <w:b/>
+                <w:bCs/>
+              </w:rPr>
+              <w:t xml:space="preserve">Dongshan Precision</w:t>
+              <w:br/>
+              <w:t xml:space="preserve">A RMB139.75; H offer TBA</w:t>
+            </w:r>
+          </w:p>
+        </w:tc>
+      </w:tr>
+      <w:tr>
+        <w:trPr>
+          <w:cantSplit/>
+        </w:trPr>
+        <w:tc>
+          <w:tcPr>
+            <w:tcW w:w="2500" w:type="dxa"/>
+            <w:hideMark/>
+            <w:vAlign w:val="center"/>
+          </w:tcPr>
+          <w:p>
+            <w:pPr>
+              <w:rPr>
+                <w:rFonts w:ascii="Arial" w:eastAsiaTheme="minorEastAsia" w:hAnsi="Arial" w:cs="Arial"/>
+                <w:color w:val="153D63"/>
+                <w:sz w:val="20"/>
+                <w:szCs w:val="20"/>
+              </w:rPr>
+              <w:spacing w:after="0" w:before="0" w:line="240" w:lineRule="auto"/>
+              <w:keepLines/>
+              <w:jc w:val="left"/>
+              <w:keepNext/>
+            </w:pPr>
+            <w:r>
+              <w:rPr>
+                <w:rFonts w:ascii="Arial" w:hAnsi="Arial" w:cs="Arial"/>
+                <w:color w:val="153D63"/>
+                <w:sz w:val="20"/>
+                <w:szCs w:val="20"/>
+                <w:b/>
+                <w:bCs/>
+              </w:rPr>
+              <w:t xml:space="preserve">AI exposure</w:t>
+            </w:r>
+          </w:p>
+        </w:tc>
+        <w:tc>
+          <w:tcPr>
+            <w:tcW w:w="3736" w:type="dxa"/>
+            <w:hideMark/>
+            <w:vAlign w:val="center"/>
+          </w:tcPr>
+          <w:p>
+            <w:pPr>
+              <w:rPr>
+                <w:rFonts w:ascii="Arial" w:eastAsiaTheme="minorEastAsia" w:hAnsi="Arial" w:cs="Arial"/>
+                <w:color w:val="153D63"/>
+                <w:sz w:val="20"/>
+                <w:szCs w:val="20"/>
+              </w:rPr>
+              <w:spacing w:after="0" w:before="0" w:line="240" w:lineRule="auto"/>
+              <w:keepLines/>
+              <w:jc w:val="left"/>
+              <w:keepNext/>
+            </w:pPr>
+            <w:r>
+              <w:rPr>
+                <w:rFonts w:ascii="Arial" w:hAnsi="Arial" w:cs="Arial"/>
+                <w:color w:val="153D63"/>
+                <w:sz w:val="20"/>
+                <w:szCs w:val="20"/>
+              </w:rPr>
+              <w:t xml:space="preserve">AI server / switch PCBs; PCBs inside optical modules</w:t>
+            </w:r>
+          </w:p>
+        </w:tc>
+        <w:tc>
+          <w:tcPr>
+            <w:tcW w:w="3736" w:type="dxa"/>
+            <w:hideMark/>
+            <w:vAlign w:val="center"/>
+          </w:tcPr>
+          <w:p>
+            <w:pPr>
+              <w:rPr>
+                <w:rFonts w:ascii="Arial" w:eastAsiaTheme="minorEastAsia" w:hAnsi="Arial" w:cs="Arial"/>
+                <w:color w:val="153D63"/>
+                <w:sz w:val="20"/>
+                <w:szCs w:val="20"/>
+              </w:rPr>
+              <w:spacing w:after="0" w:before="0" w:line="240" w:lineRule="auto"/>
+              <w:keepLines/>
+              <w:jc w:val="left"/>
+              <w:keepNext/>
+            </w:pPr>
+            <w:r>
+              <w:rPr>
+                <w:rFonts w:ascii="Arial" w:hAnsi="Arial" w:cs="Arial"/>
+                <w:color w:val="153D63"/>
+                <w:sz w:val="20"/>
+                <w:szCs w:val="20"/>
+              </w:rPr>
+              <w:t xml:space="preserve">AI PCBs plus complete 800G/1.6T optical modules</w:t>
+            </w:r>
+          </w:p>
+        </w:tc>
+      </w:tr>
+      <w:tr>
+        <w:trPr>
+          <w:cantSplit/>
+        </w:trPr>
+        <w:tc>
+          <w:tcPr>
+            <w:tcW w:w="2500" w:type="dxa"/>
+            <w:hideMark/>
+            <w:vAlign w:val="center"/>
+          </w:tcPr>
+          <w:p>
+            <w:pPr>
+              <w:rPr>
+                <w:rFonts w:ascii="Arial" w:eastAsiaTheme="minorEastAsia" w:hAnsi="Arial" w:cs="Arial"/>
+                <w:color w:val="153D63"/>
+                <w:sz w:val="20"/>
+                <w:szCs w:val="20"/>
+              </w:rPr>
+              <w:spacing w:after="0" w:before="0" w:line="240" w:lineRule="auto"/>
+              <w:keepLines/>
+              <w:jc w:val="left"/>
+              <w:keepNext/>
+            </w:pPr>
+            <w:r>
+              <w:rPr>
+                <w:rFonts w:ascii="Arial" w:hAnsi="Arial" w:cs="Arial"/>
+                <w:color w:val="153D63"/>
+                <w:sz w:val="20"/>
+                <w:szCs w:val="20"/>
+                <w:b/>
+                <w:bCs/>
+              </w:rPr>
+              <w:t xml:space="preserve">FY2025 global position</w:t>
+            </w:r>
+          </w:p>
+        </w:tc>
+        <w:tc>
+          <w:tcPr>
+            <w:tcW w:w="3736" w:type="dxa"/>
+            <w:hideMark/>
+            <w:vAlign w:val="center"/>
+          </w:tcPr>
+          <w:p>
+            <w:pPr>
+              <w:rPr>
+                <w:rFonts w:ascii="Arial" w:eastAsiaTheme="minorEastAsia" w:hAnsi="Arial" w:cs="Arial"/>
+                <w:color w:val="153D63"/>
+                <w:sz w:val="20"/>
+                <w:szCs w:val="20"/>
+              </w:rPr>
+              <w:spacing w:after="0" w:before="0" w:line="240" w:lineRule="auto"/>
+              <w:keepLines/>
+              <w:jc w:val="left"/>
+              <w:keepNext/>
+            </w:pPr>
+            <w:r>
+              <w:rPr>
+                <w:rFonts w:ascii="Arial" w:hAnsi="Arial" w:cs="Arial"/>
+                <w:color w:val="153D63"/>
+                <w:sz w:val="20"/>
+                <w:szCs w:val="20"/>
+              </w:rPr>
+              <w:t xml:space="preserve">PCB No.11 (2.5%); automotive PCB No.1 (10.6%)</w:t>
+            </w:r>
+          </w:p>
+        </w:tc>
+        <w:tc>
+          <w:tcPr>
+            <w:tcW w:w="3736" w:type="dxa"/>
+            <w:hideMark/>
+            <w:vAlign w:val="center"/>
+          </w:tcPr>
+          <w:p>
+            <w:pPr>
+              <w:rPr>
+                <w:rFonts w:ascii="Arial" w:eastAsiaTheme="minorEastAsia" w:hAnsi="Arial" w:cs="Arial"/>
+                <w:color w:val="153D63"/>
+                <w:sz w:val="20"/>
+                <w:szCs w:val="20"/>
+              </w:rPr>
+              <w:spacing w:after="0" w:before="0" w:line="240" w:lineRule="auto"/>
+              <w:keepLines/>
+              <w:jc w:val="left"/>
+              <w:keepNext/>
+            </w:pPr>
+            <w:r>
+              <w:rPr>
+                <w:rFonts w:ascii="Arial" w:hAnsi="Arial" w:cs="Arial"/>
+                <w:color w:val="153D63"/>
+                <w:sz w:val="20"/>
+                <w:szCs w:val="20"/>
+              </w:rPr>
+              <w:t xml:space="preserve">PCB No.3 (4.2%); FPC No.2 (24.5%); optics No.7 (2.9%)</w:t>
+            </w:r>
+          </w:p>
+        </w:tc>
+      </w:tr>
+      <w:tr>
+        <w:trPr>
+          <w:cantSplit/>
+        </w:trPr>
+        <w:tc>
+          <w:tcPr>
+            <w:tcW w:w="2500" w:type="dxa"/>
+            <w:hideMark/>
+            <w:vAlign w:val="center"/>
+          </w:tcPr>
+          <w:p>
+            <w:pPr>
+              <w:rPr>
+                <w:rFonts w:ascii="Arial" w:eastAsiaTheme="minorEastAsia" w:hAnsi="Arial" w:cs="Arial"/>
+                <w:color w:val="153D63"/>
+                <w:sz w:val="20"/>
+                <w:szCs w:val="20"/>
+              </w:rPr>
+              <w:spacing w:after="0" w:before="0" w:line="240" w:lineRule="auto"/>
+              <w:keepLines/>
+              <w:jc w:val="left"/>
+              <w:keepNext/>
+            </w:pPr>
+            <w:r>
+              <w:rPr>
+                <w:rFonts w:ascii="Arial" w:hAnsi="Arial" w:cs="Arial"/>
+                <w:color w:val="153D63"/>
+                <w:sz w:val="20"/>
+                <w:szCs w:val="20"/>
+                <w:b/>
+                <w:bCs/>
+              </w:rPr>
+              <w:t xml:space="preserve">H1 sales / YoY</w:t>
+            </w:r>
+          </w:p>
+        </w:tc>
+        <w:tc>
+          <w:tcPr>
+            <w:tcW w:w="3736" w:type="dxa"/>
+            <w:hideMark/>
+            <w:vAlign w:val="center"/>
+          </w:tcPr>
+          <w:p>
+            <w:pPr>
+              <w:rPr>
+                <w:rFonts w:ascii="Arial" w:eastAsiaTheme="minorEastAsia" w:hAnsi="Arial" w:cs="Arial"/>
+                <w:color w:val="153D63"/>
+                <w:sz w:val="20"/>
+                <w:szCs w:val="20"/>
+              </w:rPr>
+              <w:spacing w:after="0" w:before="0" w:line="240" w:lineRule="auto"/>
+              <w:keepLines/>
+              <w:jc w:val="left"/>
+              <w:keepNext/>
+            </w:pPr>
+            <w:r>
+              <w:rPr>
+                <w:rFonts w:ascii="Arial" w:hAnsi="Arial" w:cs="Arial"/>
+                <w:color w:val="153D63"/>
+                <w:sz w:val="20"/>
+                <w:szCs w:val="20"/>
+              </w:rPr>
+              <w:t xml:space="preserve">RMB8.61bn / +21%</w:t>
+            </w:r>
+          </w:p>
+        </w:tc>
+        <w:tc>
+          <w:tcPr>
+            <w:tcW w:w="3736" w:type="dxa"/>
+            <w:hideMark/>
+            <w:vAlign w:val="center"/>
+          </w:tcPr>
+          <w:p>
+            <w:pPr>
+              <w:rPr>
+                <w:rFonts w:ascii="Arial" w:eastAsiaTheme="minorEastAsia" w:hAnsi="Arial" w:cs="Arial"/>
+                <w:color w:val="153D63"/>
+                <w:sz w:val="20"/>
+                <w:szCs w:val="20"/>
+              </w:rPr>
+              <w:spacing w:after="0" w:before="0" w:line="240" w:lineRule="auto"/>
+              <w:keepLines/>
+              <w:jc w:val="left"/>
+              <w:keepNext/>
+            </w:pPr>
+            <w:r>
+              <w:rPr>
+                <w:rFonts w:ascii="Arial" w:hAnsi="Arial" w:cs="Arial"/>
+                <w:color w:val="153D63"/>
+                <w:sz w:val="20"/>
+                <w:szCs w:val="20"/>
+              </w:rPr>
+              <w:t xml:space="preserve">RMB27.80bn / +64%</w:t>
+            </w:r>
+          </w:p>
+        </w:tc>
+      </w:tr>
+      <w:tr>
+        <w:trPr>
+          <w:cantSplit/>
+        </w:trPr>
+        <w:tc>
+          <w:tcPr>
+            <w:tcW w:w="2500" w:type="dxa"/>
+            <w:hideMark/>
+            <w:vAlign w:val="center"/>
+          </w:tcPr>
+          <w:p>
+            <w:pPr>
+              <w:rPr>
+                <w:rFonts w:ascii="Arial" w:eastAsiaTheme="minorEastAsia" w:hAnsi="Arial" w:cs="Arial"/>
+                <w:color w:val="153D63"/>
+                <w:sz w:val="20"/>
+                <w:szCs w:val="20"/>
+              </w:rPr>
+              <w:spacing w:after="0" w:before="0" w:line="240" w:lineRule="auto"/>
+              <w:keepLines/>
+              <w:jc w:val="left"/>
+              <w:keepNext/>
+            </w:pPr>
+            <w:r>
+              <w:rPr>
+                <w:rFonts w:ascii="Arial" w:hAnsi="Arial" w:cs="Arial"/>
+                <w:color w:val="153D63"/>
+                <w:sz w:val="20"/>
+                <w:szCs w:val="20"/>
+                <w:b/>
+                <w:bCs/>
+              </w:rPr>
+              <w:t xml:space="preserve">H1 owner profit / YoY</w:t>
+            </w:r>
+          </w:p>
+        </w:tc>
+        <w:tc>
+          <w:tcPr>
+            <w:tcW w:w="3736" w:type="dxa"/>
+            <w:hideMark/>
+            <w:vAlign w:val="center"/>
+          </w:tcPr>
+          <w:p>
+            <w:pPr>
+              <w:rPr>
+                <w:rFonts w:ascii="Arial" w:eastAsiaTheme="minorEastAsia" w:hAnsi="Arial" w:cs="Arial"/>
+                <w:color w:val="153D63"/>
+                <w:sz w:val="20"/>
+                <w:szCs w:val="20"/>
+              </w:rPr>
+              <w:spacing w:after="0" w:before="0" w:line="240" w:lineRule="auto"/>
+              <w:keepLines/>
+              <w:jc w:val="left"/>
+              <w:keepNext/>
+            </w:pPr>
+            <w:r>
+              <w:rPr>
+                <w:rFonts w:ascii="Arial" w:hAnsi="Arial" w:cs="Arial"/>
+                <w:color w:val="153D63"/>
+                <w:sz w:val="20"/>
+                <w:szCs w:val="20"/>
+              </w:rPr>
+              <w:t xml:space="preserve">RMB0.602bn / -7%</w:t>
+            </w:r>
+          </w:p>
+        </w:tc>
+        <w:tc>
+          <w:tcPr>
+            <w:tcW w:w="3736" w:type="dxa"/>
+            <w:hideMark/>
+            <w:vAlign w:val="center"/>
+          </w:tcPr>
+          <w:p>
+            <w:pPr>
+              <w:rPr>
+                <w:rFonts w:ascii="Arial" w:eastAsiaTheme="minorEastAsia" w:hAnsi="Arial" w:cs="Arial"/>
+                <w:color w:val="153D63"/>
+                <w:sz w:val="20"/>
+                <w:szCs w:val="20"/>
+              </w:rPr>
+              <w:spacing w:after="0" w:before="0" w:line="240" w:lineRule="auto"/>
+              <w:keepLines/>
+              <w:jc w:val="left"/>
+              <w:keepNext/>
+            </w:pPr>
+            <w:r>
+              <w:rPr>
+                <w:rFonts w:ascii="Arial" w:hAnsi="Arial" w:cs="Arial"/>
+                <w:color w:val="153D63"/>
+                <w:sz w:val="20"/>
+                <w:szCs w:val="20"/>
+              </w:rPr>
+              <w:t xml:space="preserve">RMB2.957bn / +290%</w:t>
+            </w:r>
+          </w:p>
+        </w:tc>
+      </w:tr>
+      <w:tr>
+        <w:trPr>
+          <w:cantSplit/>
+        </w:trPr>
+        <w:tc>
+          <w:tcPr>
+            <w:tcW w:w="2500" w:type="dxa"/>
+            <w:hideMark/>
+            <w:vAlign w:val="center"/>
+          </w:tcPr>
+          <w:p>
+            <w:pPr>
+              <w:rPr>
+                <w:rFonts w:ascii="Arial" w:eastAsiaTheme="minorEastAsia" w:hAnsi="Arial" w:cs="Arial"/>
+                <w:color w:val="153D63"/>
+                <w:sz w:val="20"/>
+                <w:szCs w:val="20"/>
+              </w:rPr>
+              <w:spacing w:after="0" w:before="0" w:line="240" w:lineRule="auto"/>
+              <w:keepLines/>
+              <w:jc w:val="left"/>
+              <w:keepNext/>
+            </w:pPr>
+            <w:r>
+              <w:rPr>
+                <w:rFonts w:ascii="Arial" w:hAnsi="Arial" w:cs="Arial"/>
+                <w:color w:val="153D63"/>
+                <w:sz w:val="20"/>
+                <w:szCs w:val="20"/>
+                <w:b/>
+                <w:bCs/>
+              </w:rPr>
+              <w:t xml:space="preserve">H1 gross margin</w:t>
+            </w:r>
+          </w:p>
+        </w:tc>
+        <w:tc>
+          <w:tcPr>
+            <w:tcW w:w="3736" w:type="dxa"/>
+            <w:hideMark/>
+            <w:vAlign w:val="center"/>
+          </w:tcPr>
+          <w:p>
+            <w:pPr>
+              <w:rPr>
+                <w:rFonts w:ascii="Arial" w:eastAsiaTheme="minorEastAsia" w:hAnsi="Arial" w:cs="Arial"/>
+                <w:color w:val="153D63"/>
+                <w:sz w:val="20"/>
+                <w:szCs w:val="20"/>
+              </w:rPr>
+              <w:spacing w:after="0" w:before="0" w:line="240" w:lineRule="auto"/>
+              <w:keepLines/>
+              <w:jc w:val="left"/>
+              <w:keepNext/>
+            </w:pPr>
+            <w:r>
+              <w:rPr>
+                <w:rFonts w:ascii="Arial" w:hAnsi="Arial" w:cs="Arial"/>
+                <w:color w:val="153D63"/>
+                <w:sz w:val="20"/>
+                <w:szCs w:val="20"/>
+              </w:rPr>
+              <w:t xml:space="preserve">20.22%</w:t>
+            </w:r>
+          </w:p>
+        </w:tc>
+        <w:tc>
+          <w:tcPr>
+            <w:tcW w:w="3736" w:type="dxa"/>
+            <w:hideMark/>
+            <w:vAlign w:val="center"/>
+          </w:tcPr>
+          <w:p>
+            <w:pPr>
+              <w:rPr>
+                <w:rFonts w:ascii="Arial" w:eastAsiaTheme="minorEastAsia" w:hAnsi="Arial" w:cs="Arial"/>
+                <w:color w:val="153D63"/>
+                <w:sz w:val="20"/>
+                <w:szCs w:val="20"/>
+              </w:rPr>
+              <w:spacing w:after="0" w:before="0" w:line="240" w:lineRule="auto"/>
+              <w:keepLines/>
+              <w:jc w:val="left"/>
+              <w:keepNext/>
+            </w:pPr>
+            <w:r>
+              <w:rPr>
+                <w:rFonts w:ascii="Arial" w:hAnsi="Arial" w:cs="Arial"/>
+                <w:color w:val="153D63"/>
+                <w:sz w:val="20"/>
+                <w:szCs w:val="20"/>
+              </w:rPr>
+              <w:t xml:space="preserve">20.15%</w:t>
+            </w:r>
+          </w:p>
+        </w:tc>
+      </w:tr>
+      <w:tr>
+        <w:trPr>
+          <w:cantSplit/>
+        </w:trPr>
+        <w:tc>
+          <w:tcPr>
+            <w:tcW w:w="2500" w:type="dxa"/>
+            <w:hideMark/>
+            <w:vAlign w:val="center"/>
+          </w:tcPr>
+          <w:p>
+            <w:pPr>
+              <w:rPr>
+                <w:rFonts w:ascii="Arial" w:eastAsiaTheme="minorEastAsia" w:hAnsi="Arial" w:cs="Arial"/>
+                <w:color w:val="153D63"/>
+                <w:sz w:val="20"/>
+                <w:szCs w:val="20"/>
+              </w:rPr>
+              <w:spacing w:after="0" w:before="0" w:line="240" w:lineRule="auto"/>
+              <w:keepLines/>
+              <w:jc w:val="left"/>
+              <w:keepNext/>
+            </w:pPr>
+            <w:r>
+              <w:rPr>
+                <w:rFonts w:ascii="Arial" w:hAnsi="Arial" w:cs="Arial"/>
+                <w:color w:val="153D63"/>
+                <w:sz w:val="20"/>
+                <w:szCs w:val="20"/>
+                <w:b/>
+                <w:bCs/>
+              </w:rPr>
+              <w:t xml:space="preserve">H1 operating cash / capex</w:t>
+            </w:r>
+          </w:p>
+        </w:tc>
+        <w:tc>
+          <w:tcPr>
+            <w:tcW w:w="3736" w:type="dxa"/>
+            <w:hideMark/>
+            <w:vAlign w:val="center"/>
+          </w:tcPr>
+          <w:p>
+            <w:pPr>
+              <w:rPr>
+                <w:rFonts w:ascii="Arial" w:eastAsiaTheme="minorEastAsia" w:hAnsi="Arial" w:cs="Arial"/>
+                <w:color w:val="153D63"/>
+                <w:sz w:val="20"/>
+                <w:szCs w:val="20"/>
+              </w:rPr>
+              <w:spacing w:after="0" w:before="0" w:line="240" w:lineRule="auto"/>
+              <w:keepLines/>
+              <w:jc w:val="left"/>
+              <w:keepNext/>
+            </w:pPr>
+            <w:r>
+              <w:rPr>
+                <w:rFonts w:ascii="Arial" w:hAnsi="Arial" w:cs="Arial"/>
+                <w:color w:val="153D63"/>
+                <w:sz w:val="20"/>
+                <w:szCs w:val="20"/>
+              </w:rPr>
+              <w:t xml:space="preserve">RMB0.60bn / RMB3.20bn</w:t>
+            </w:r>
+          </w:p>
+        </w:tc>
+        <w:tc>
+          <w:tcPr>
+            <w:tcW w:w="3736" w:type="dxa"/>
+            <w:hideMark/>
+            <w:vAlign w:val="center"/>
+          </w:tcPr>
+          <w:p>
+            <w:pPr>
+              <w:rPr>
+                <w:rFonts w:ascii="Arial" w:eastAsiaTheme="minorEastAsia" w:hAnsi="Arial" w:cs="Arial"/>
+                <w:color w:val="153D63"/>
+                <w:sz w:val="20"/>
+                <w:szCs w:val="20"/>
+              </w:rPr>
+              <w:spacing w:after="0" w:before="0" w:line="240" w:lineRule="auto"/>
+              <w:keepLines/>
+              <w:jc w:val="left"/>
+              <w:keepNext/>
+            </w:pPr>
+            <w:r>
+              <w:rPr>
+                <w:rFonts w:ascii="Arial" w:hAnsi="Arial" w:cs="Arial"/>
+                <w:color w:val="153D63"/>
+                <w:sz w:val="20"/>
+                <w:szCs w:val="20"/>
+              </w:rPr>
+              <w:t xml:space="preserve">RMB2.38bn / RMB5.25bn</w:t>
+            </w:r>
+          </w:p>
+        </w:tc>
+      </w:tr>
+      <w:tr>
+        <w:trPr>
+          <w:cantSplit/>
+        </w:trPr>
+        <w:tc>
+          <w:tcPr>
+            <w:tcW w:w="2500" w:type="dxa"/>
+            <w:hideMark/>
+            <w:vAlign w:val="center"/>
+          </w:tcPr>
+          <w:p>
+            <w:pPr>
+              <w:rPr>
+                <w:rFonts w:ascii="Arial" w:eastAsiaTheme="minorEastAsia" w:hAnsi="Arial" w:cs="Arial"/>
+                <w:color w:val="153D63"/>
+                <w:sz w:val="20"/>
+                <w:szCs w:val="20"/>
+              </w:rPr>
+              <w:spacing w:after="0" w:before="0" w:line="240" w:lineRule="auto"/>
+              <w:keepLines/>
+              <w:jc w:val="left"/>
+              <w:keepNext/>
+            </w:pPr>
+            <w:r>
+              <w:rPr>
+                <w:rFonts w:ascii="Arial" w:hAnsi="Arial" w:cs="Arial"/>
+                <w:color w:val="153D63"/>
+                <w:sz w:val="20"/>
+                <w:szCs w:val="20"/>
+                <w:b/>
+                <w:bCs/>
+              </w:rPr>
+              <w:t xml:space="preserve">FY2026E / FY2027E owner profit</w:t>
+            </w:r>
+          </w:p>
+        </w:tc>
+        <w:tc>
+          <w:tcPr>
+            <w:tcW w:w="3736" w:type="dxa"/>
+            <w:hideMark/>
+            <w:vAlign w:val="center"/>
+          </w:tcPr>
+          <w:p>
+            <w:pPr>
+              <w:rPr>
+                <w:rFonts w:ascii="Arial" w:eastAsiaTheme="minorEastAsia" w:hAnsi="Arial" w:cs="Arial"/>
+                <w:color w:val="153D63"/>
+                <w:sz w:val="20"/>
+                <w:szCs w:val="20"/>
+              </w:rPr>
+              <w:spacing w:after="0" w:before="0" w:line="240" w:lineRule="auto"/>
+              <w:keepLines/>
+              <w:jc w:val="left"/>
+              <w:keepNext/>
+            </w:pPr>
+            <w:r>
+              <w:rPr>
+                <w:rFonts w:ascii="Arial" w:hAnsi="Arial" w:cs="Arial"/>
+                <w:color w:val="153D63"/>
+                <w:sz w:val="20"/>
+                <w:szCs w:val="20"/>
+              </w:rPr>
+              <w:t xml:space="preserve">RMB2.207bn / RMB3.707bn</w:t>
+              <w:br/>
+              <w:t xml:space="preserve">FY2027E growth +68%</w:t>
+            </w:r>
+          </w:p>
+        </w:tc>
+        <w:tc>
+          <w:tcPr>
+            <w:tcW w:w="3736" w:type="dxa"/>
+            <w:hideMark/>
+            <w:vAlign w:val="center"/>
+          </w:tcPr>
+          <w:p>
+            <w:pPr>
+              <w:rPr>
+                <w:rFonts w:ascii="Arial" w:eastAsiaTheme="minorEastAsia" w:hAnsi="Arial" w:cs="Arial"/>
+                <w:color w:val="153D63"/>
+                <w:sz w:val="20"/>
+                <w:szCs w:val="20"/>
+              </w:rPr>
+              <w:spacing w:after="0" w:before="0" w:line="240" w:lineRule="auto"/>
+              <w:keepLines/>
+              <w:jc w:val="left"/>
+              <w:keepNext/>
+            </w:pPr>
+            <w:r>
+              <w:rPr>
+                <w:rFonts w:ascii="Arial" w:hAnsi="Arial" w:cs="Arial"/>
+                <w:color w:val="153D63"/>
+                <w:sz w:val="20"/>
+                <w:szCs w:val="20"/>
+              </w:rPr>
+              <w:t xml:space="preserve">RMB7.231bn / RMB15.214bn</w:t>
+              <w:br/>
+              <w:t xml:space="preserve">FY2027E growth +110%</w:t>
+            </w:r>
+          </w:p>
+        </w:tc>
+      </w:tr>
+      <w:tr>
+        <w:trPr>
+          <w:cantSplit/>
+        </w:trPr>
+        <w:tc>
+          <w:tcPr>
+            <w:tcW w:w="2500" w:type="dxa"/>
+            <w:hideMark/>
+            <w:vAlign w:val="center"/>
+          </w:tcPr>
+          <w:p>
+            <w:pPr>
+              <w:rPr>
+                <w:rFonts w:ascii="Arial" w:eastAsiaTheme="minorEastAsia" w:hAnsi="Arial" w:cs="Arial"/>
+                <w:color w:val="153D63"/>
+                <w:sz w:val="20"/>
+                <w:szCs w:val="20"/>
+              </w:rPr>
+              <w:spacing w:after="0" w:before="0" w:line="240" w:lineRule="auto"/>
+              <w:keepLines/>
+              <w:jc w:val="left"/>
+            </w:pPr>
+            <w:r>
+              <w:rPr>
+                <w:rFonts w:ascii="Arial" w:hAnsi="Arial" w:cs="Arial"/>
+                <w:color w:val="153D63"/>
+                <w:sz w:val="20"/>
+                <w:szCs w:val="20"/>
+                <w:b/>
+                <w:bCs/>
+              </w:rPr>
+              <w:t xml:space="preserve">FY2026E / FY2027E P/E</w:t>
+            </w:r>
+          </w:p>
+        </w:tc>
+        <w:tc>
+          <w:tcPr>
+            <w:tcW w:w="3736" w:type="dxa"/>
+            <w:hideMark/>
+            <w:vAlign w:val="center"/>
+          </w:tcPr>
+          <w:p>
+            <w:pPr>
+              <w:rPr>
+                <w:rFonts w:ascii="Arial" w:eastAsiaTheme="minorEastAsia" w:hAnsi="Arial" w:cs="Arial"/>
+                <w:color w:val="153D63"/>
+                <w:sz w:val="20"/>
+                <w:szCs w:val="20"/>
+              </w:rPr>
+              <w:spacing w:after="0" w:before="0" w:line="240" w:lineRule="auto"/>
+              <w:keepLines/>
+              <w:jc w:val="left"/>
+            </w:pPr>
+            <w:r>
+              <w:rPr>
+                <w:rFonts w:ascii="Arial" w:hAnsi="Arial" w:cs="Arial"/>
+                <w:color w:val="153D63"/>
+                <w:sz w:val="20"/>
+                <w:szCs w:val="20"/>
+              </w:rPr>
+              <w:t xml:space="preserve">H 30.0x / 17.8x</w:t>
+              <w:br/>
+              <w:t xml:space="preserve">A 48.0x / 28.6x</w:t>
+            </w:r>
+          </w:p>
+        </w:tc>
+        <w:tc>
+          <w:tcPr>
+            <w:tcW w:w="3736" w:type="dxa"/>
+            <w:hideMark/>
+            <w:vAlign w:val="center"/>
+          </w:tcPr>
+          <w:p>
+            <w:pPr>
+              <w:rPr>
+                <w:rFonts w:ascii="Arial" w:eastAsiaTheme="minorEastAsia" w:hAnsi="Arial" w:cs="Arial"/>
+                <w:color w:val="153D63"/>
+                <w:sz w:val="20"/>
+                <w:szCs w:val="20"/>
+              </w:rPr>
+              <w:spacing w:after="0" w:before="0" w:line="240" w:lineRule="auto"/>
+              <w:keepLines/>
+              <w:jc w:val="left"/>
+            </w:pPr>
+            <w:r>
+              <w:rPr>
+                <w:rFonts w:ascii="Arial" w:hAnsi="Arial" w:cs="Arial"/>
+                <w:color w:val="153D63"/>
+                <w:sz w:val="20"/>
+                <w:szCs w:val="20"/>
+              </w:rPr>
+              <w:t xml:space="preserve">A 35.4x / 16.8x</w:t>
+              <w:br/>
+              <w:t xml:space="preserve">H offer pending</w:t>
+            </w:r>
+          </w:p>
+        </w:tc>
+      </w:tr>
+    </w:tbl>
+    <w:p>
+      <w:pPr>
+        <w:pStyle w:val="ListParagraph"/>
+        <w:numPr>
+          <w:ilvl w:val="0"/>
+          <w:numId w:val="10"/>
+        </w:numPr>
+        <w:rPr>
+          <w:rFonts w:ascii="Arial" w:eastAsia="Times New Roman" w:hAnsi="Arial" w:cs="Arial"/>
+          <w:color w:val="153D63"/>
+          <w:sz w:val="20"/>
+          <w:szCs w:val="20"/>
+        </w:rPr>
+        <w:spacing w:after="65" w:before="65" w:line="240" w:lineRule="auto"/>
+        <w:keepLines/>
+      </w:pPr>
+      <w:r>
+        <w:rPr>
+          <w:rFonts w:ascii="Arial" w:hAnsi="Arial" w:cs="Arial"/>
+          <w:color w:val="153D63"/>
+          <w:sz w:val="20"/>
+          <w:szCs w:val="20"/>
+          <w:b/>
+          <w:bCs/>
+        </w:rPr>
+        <w:t xml:space="preserve">Good - Kinwong's recovery has a fresh catalyst.</w:t>
+      </w:r>
+      <w:r>
+        <w:rPr>
+          <w:rFonts w:ascii="Arial" w:hAnsi="Arial" w:cs="Arial"/>
+          <w:color w:val="153D63"/>
+          <w:sz w:val="20"/>
+          <w:szCs w:val="20"/>
+        </w:rPr>
+        <w:t xml:space="preserve"> Its 10 October preliminary Q3 guidance is RMB0.912-1.089bn owner profit (+205-265% YoY), above the whole H1. Profit excluding non-recurring items is RMB0.939-1.116bn: the rebound is operational. AI PCB shipments and better material-cost pass-through support the turn; formal results must confirm it.</w:t>
+      </w:r>
+    </w:p>
+    <w:p>
+      <w:pPr>
+        <w:pStyle w:val="ListParagraph"/>
+        <w:numPr>
+          <w:ilvl w:val="0"/>
+          <w:numId w:val="10"/>
+        </w:numPr>
+        <w:rPr>
+          <w:rFonts w:ascii="Arial" w:eastAsia="Times New Roman" w:hAnsi="Arial" w:cs="Arial"/>
+          <w:color w:val="153D63"/>
+          <w:sz w:val="20"/>
+          <w:szCs w:val="20"/>
+        </w:rPr>
+        <w:spacing w:after="65" w:before="65" w:line="240" w:lineRule="auto"/>
+        <w:keepLines/>
+      </w:pPr>
+      <w:r>
+        <w:rPr>
+          <w:rFonts w:ascii="Arial" w:hAnsi="Arial" w:cs="Arial"/>
+          <w:color w:val="153D63"/>
+          <w:sz w:val="20"/>
+          <w:szCs w:val="20"/>
+          <w:b/>
+          <w:bCs/>
+        </w:rPr>
+        <w:t xml:space="preserve">Bad - neither is a steady cash compounder yet.</w:t>
+      </w:r>
+      <w:r>
+        <w:rPr>
+          <w:rFonts w:ascii="Arial" w:hAnsi="Arial" w:cs="Arial"/>
+          <w:color w:val="153D63"/>
+          <w:sz w:val="20"/>
+          <w:szCs w:val="20"/>
+        </w:rPr>
+        <w:t xml:space="preserve"> Kinwong's H1 profit fell and included RMB136m non-recurring gains. Capex was 5.3x operating cash, versus Dongshan's 2.2x. Both gross margins were about 20%: AI exposure has yet to create a group margin gap. Watch utilisation, yields and cash conversion; Dongshan also carries acquisition integration and consumer FPC exposure.</w:t>
+      </w:r>
+    </w:p>
+    <w:p>
+      <w:pPr>
+        <w:pStyle w:val="ListParagraph"/>
+        <w:numPr>
+          <w:ilvl w:val="0"/>
+          <w:numId w:val="10"/>
+        </w:numPr>
+        <w:rPr>
+          <w:rFonts w:ascii="Arial" w:eastAsia="Times New Roman" w:hAnsi="Arial" w:cs="Arial"/>
+          <w:color w:val="153D63"/>
+          <w:sz w:val="20"/>
+          <w:szCs w:val="20"/>
+        </w:rPr>
+        <w:spacing w:after="65" w:before="65" w:line="240" w:lineRule="auto"/>
+        <w:keepLines/>
+      </w:pPr>
+      <w:r>
+        <w:rPr>
+          <w:rFonts w:ascii="Arial" w:hAnsi="Arial" w:cs="Arial"/>
+          <w:color w:val="153D63"/>
+          <w:sz w:val="20"/>
+          <w:szCs w:val="20"/>
+          <w:b/>
+          <w:bCs/>
+        </w:rPr>
+        <w:t xml:space="preserve">Valuation - Dongshan's cheaper FY2027 multiple needs more growth.</w:t>
+      </w:r>
+      <w:r>
+        <w:rPr>
+          <w:rFonts w:ascii="Arial" w:hAnsi="Arial" w:cs="Arial"/>
+          <w:color w:val="153D63"/>
+          <w:sz w:val="20"/>
+          <w:szCs w:val="20"/>
+        </w:rPr>
+        <w:t xml:space="preserve"> Kinwong H is 30.0x FY2026E versus Dongshan A at 35.4x. By FY2027E, Dongshan is 16.8x versus 17.8x, but assumes 110% profit growth against Kinwong's 68%. Kinwong H's 37.5% A discount is a reference; Dongshan's H offer needs its own post-issue P/E and dilution check.</w:t>
+      </w:r>
+    </w:p>
+    <w:p>
+      <w:pPr>
+        <w:rPr>
+          <w:rFonts w:ascii="Arial" w:eastAsiaTheme="minorEastAsia" w:hAnsi="Arial" w:cs="Arial"/>
+          <w:color w:val="153D63"/>
+          <w:sz w:val="20"/>
+          <w:szCs w:val="20"/>
+        </w:rPr>
+        <w:spacing w:after="60" w:before="80" w:line="240" w:lineRule="auto"/>
+        <w:keepLines/>
+      </w:pPr>
+      <w:r>
+        <w:rPr>
+          <w:rFonts w:ascii="Arial" w:hAnsi="Arial" w:cs="Arial"/>
+          <w:color w:val="153D63"/>
+          <w:sz w:val="20"/>
+          <w:szCs w:val="20"/>
+        </w:rPr>
+        <w:t xml:space="preserve">Prices: 13 Oct close. H1 2026 figures use PRC accounts for both companies. Capex is cash paid for fixed, intangible and other long-term assets, not total investing outflow. Forecasts: Guosen 18 Sep (Kinwong), Shanghai 28 Aug (Dongshan); selected estimates, not consensus. Kinwong's forecast predates its new Q3 guidance; the guidance is not an updated FY2026 estimate. Optics rank refers to Source Photonics standalone FY2025 sales.</w:t>
+      </w:r>
+    </w:p>
+    <w:p>
+      <w:pPr>
+        <w:rPr>
+          <w:rFonts w:ascii="Arial" w:eastAsiaTheme="minorEastAsia" w:hAnsi="Arial" w:cs="Arial"/>
+          <w:color w:val="153D63"/>
+          <w:sz w:val="20"/>
+          <w:szCs w:val="20"/>
+        </w:rPr>
+        <w:spacing w:after="50" w:before="0" w:line="240" w:lineRule="auto"/>
+        <w:keepLines/>
+      </w:pPr>
+      <w:r>
+        <w:rPr>
+          <w:rFonts w:ascii="Arial" w:hAnsi="Arial" w:cs="Arial"/>
+          <w:color w:val="153D63"/>
+          <w:sz w:val="20"/>
+          <w:szCs w:val="20"/>
+          <w:b/>
+          <w:bCs/>
+        </w:rPr>
+        <w:t xml:space="preserve">Sources: </w:t>
+      </w:r>
+      <w:hyperlink r:id="rId48">
+        <w:r>
+          <w:rPr>
+            <w:rFonts w:ascii="Arial" w:hAnsi="Arial" w:cs="Arial"/>
+            <w:color w:val="153D63"/>
+            <w:sz w:val="20"/>
+            <w:szCs w:val="20"/>
+            <w:u w:val="single"/>
+          </w:rPr>
+          <w:t xml:space="preserve">Kinwong prospectus</w:t>
+        </w:r>
+      </w:hyperlink>
+      <w:r>
+        <w:rPr>
+          <w:rFonts w:ascii="Arial" w:hAnsi="Arial" w:cs="Arial"/>
+          <w:color w:val="153D63"/>
+          <w:sz w:val="20"/>
+          <w:szCs w:val="20"/>
+        </w:rPr>
+        <w:t xml:space="preserve">; </w:t>
+      </w:r>
+      <w:hyperlink r:id="rId49">
+        <w:r>
+          <w:rPr>
+            <w:rFonts w:ascii="Arial" w:hAnsi="Arial" w:cs="Arial"/>
+            <w:color w:val="153D63"/>
+            <w:sz w:val="20"/>
+            <w:szCs w:val="20"/>
+            <w:u w:val="single"/>
+          </w:rPr>
+          <w:t xml:space="preserve">Kinwong H1</w:t>
+        </w:r>
+      </w:hyperlink>
+      <w:r>
+        <w:rPr>
+          <w:rFonts w:ascii="Arial" w:hAnsi="Arial" w:cs="Arial"/>
+          <w:color w:val="153D63"/>
+          <w:sz w:val="20"/>
+          <w:szCs w:val="20"/>
+        </w:rPr>
+        <w:t xml:space="preserve">; </w:t>
+      </w:r>
+      <w:hyperlink r:id="rId50">
+        <w:r>
+          <w:rPr>
+            <w:rFonts w:ascii="Arial" w:hAnsi="Arial" w:cs="Arial"/>
+            <w:color w:val="153D63"/>
+            <w:sz w:val="20"/>
+            <w:szCs w:val="20"/>
+            <w:u w:val="single"/>
+          </w:rPr>
+          <w:t xml:space="preserve">Kinwong Q3 guidance</w:t>
+        </w:r>
+      </w:hyperlink>
+      <w:r>
+        <w:rPr>
+          <w:rFonts w:ascii="Arial" w:hAnsi="Arial" w:cs="Arial"/>
+          <w:color w:val="153D63"/>
+          <w:sz w:val="20"/>
+          <w:szCs w:val="20"/>
+        </w:rPr>
+        <w:t xml:space="preserve">; </w:t>
+      </w:r>
+      <w:hyperlink r:id="rId51">
+        <w:r>
+          <w:rPr>
+            <w:rFonts w:ascii="Arial" w:hAnsi="Arial" w:cs="Arial"/>
+            <w:color w:val="153D63"/>
+            <w:sz w:val="20"/>
+            <w:szCs w:val="20"/>
+            <w:u w:val="single"/>
+          </w:rPr>
+          <w:t xml:space="preserve">Dongshan H1</w:t>
+        </w:r>
+      </w:hyperlink>
+      <w:r>
+        <w:rPr>
+          <w:rFonts w:ascii="Arial" w:hAnsi="Arial" w:cs="Arial"/>
+          <w:color w:val="153D63"/>
+          <w:sz w:val="20"/>
+          <w:szCs w:val="20"/>
+        </w:rPr>
+        <w:t xml:space="preserve">; </w:t>
+      </w:r>
+      <w:hyperlink r:id="rId52">
+        <w:r>
+          <w:rPr>
+            <w:rFonts w:ascii="Arial" w:hAnsi="Arial" w:cs="Arial"/>
+            <w:color w:val="153D63"/>
+            <w:sz w:val="20"/>
+            <w:szCs w:val="20"/>
+            <w:u w:val="single"/>
+          </w:rPr>
+          <w:t xml:space="preserve">Dongshan PHIP</w:t>
+        </w:r>
+      </w:hyperlink>
+      <w:r>
+        <w:rPr>
+          <w:rFonts w:ascii="Arial" w:hAnsi="Arial" w:cs="Arial"/>
+          <w:color w:val="153D63"/>
+          <w:sz w:val="20"/>
+          <w:szCs w:val="20"/>
+        </w:rPr>
+        <w:t xml:space="preserve">; </w:t>
+      </w:r>
+      <w:hyperlink r:id="rId53">
+        <w:r>
+          <w:rPr>
+            <w:rFonts w:ascii="Arial" w:hAnsi="Arial" w:cs="Arial"/>
+            <w:color w:val="153D63"/>
+            <w:sz w:val="20"/>
+            <w:szCs w:val="20"/>
+            <w:u w:val="single"/>
+          </w:rPr>
+          <w:t xml:space="preserve">Guosen 18 Sep</w:t>
+        </w:r>
+      </w:hyperlink>
+      <w:r>
+        <w:rPr>
+          <w:rFonts w:ascii="Arial" w:hAnsi="Arial" w:cs="Arial"/>
+          <w:color w:val="153D63"/>
+          <w:sz w:val="20"/>
+          <w:szCs w:val="20"/>
+        </w:rPr>
+        <w:t xml:space="preserve">; </w:t>
+      </w:r>
+      <w:hyperlink r:id="rId54">
+        <w:r>
+          <w:rPr>
+            <w:rFonts w:ascii="Arial" w:hAnsi="Arial" w:cs="Arial"/>
+            <w:color w:val="153D63"/>
+            <w:sz w:val="20"/>
+            <w:szCs w:val="20"/>
+            <w:u w:val="single"/>
+          </w:rPr>
+          <w:t xml:space="preserve">Shanghai 28 Aug</w:t>
         </w:r>
       </w:hyperlink>
     </w:p>

</xml_diff>